<commit_message>
Use Mincho font and mention COVID-era lockdown
Co-Authored-By: Claude Opus 5.5 <noreply@anthropic.com>
Claude-Session: https://claude.ai/code/session_01UunSGkA7xxcu1ZJiDN1zG2
</commit_message>
<xml_diff>
--- a/output/卒論全文_最新版.docx
+++ b/output/卒論全文_最新版.docx
@@ -754,7 +754,7 @@
       <w:pPr>
         <w:spacing w:after="40" w:line="300"/>
       </w:pPr>
-      <w:hyperlink w:history="1" r:id="rIdydrszeh2hvhrymxen6gad">
+      <w:hyperlink w:history="1" r:id="rIdgkilxr3opamo1_aoxuird">
         <w:r>
           <w:rPr>
             <w:color w:val="0563C1"/>
@@ -776,7 +776,7 @@
       <w:pPr>
         <w:spacing w:after="40" w:line="300"/>
       </w:pPr>
-      <w:hyperlink w:history="1" r:id="rIdzylshr1nydzvzurdr1dce">
+      <w:hyperlink w:history="1" r:id="rIdgkmj95jsht-gx18xilfxy">
         <w:r>
           <w:rPr>
             <w:color w:val="0563C1"/>
@@ -798,7 +798,7 @@
       <w:pPr>
         <w:spacing w:after="40" w:line="300"/>
       </w:pPr>
-      <w:hyperlink w:history="1" r:id="rIdkip4tjgk6v9vdkoemvpd_">
+      <w:hyperlink w:history="1" r:id="rIdq_wi3-dioickznzasxwbd">
         <w:r>
           <w:rPr>
             <w:color w:val="0563C1"/>
@@ -1282,7 +1282,7 @@
       <w:pPr>
         <w:spacing w:after="40" w:line="300"/>
       </w:pPr>
-      <w:hyperlink w:history="1" r:id="rIdmxw7z0jeg2puclpiwrmrd">
+      <w:hyperlink w:history="1" r:id="rIdsowjggfefwrvxvowauarb">
         <w:r>
           <w:rPr>
             <w:color w:val="0563C1"/>
@@ -2030,7 +2030,7 @@
       <w:pPr>
         <w:spacing w:after="40" w:line="300"/>
       </w:pPr>
-      <w:hyperlink w:history="1" r:id="rIdlduwggza1tqgvj_k-r6ui">
+      <w:hyperlink w:history="1" r:id="rIdoltlzcrdo3b0ba0mzqtea">
         <w:r>
           <w:rPr>
             <w:color w:val="0563C1"/>
@@ -2052,7 +2052,7 @@
       <w:pPr>
         <w:spacing w:after="40" w:line="300"/>
       </w:pPr>
-      <w:hyperlink w:history="1" r:id="rIdsm9gzrfps7verlz8stxta">
+      <w:hyperlink w:history="1" r:id="rId8zegfrky4bjhkwhjod1g3">
         <w:r>
           <w:rPr>
             <w:color w:val="0563C1"/>
@@ -2074,7 +2074,7 @@
       <w:pPr>
         <w:spacing w:after="40" w:line="300"/>
       </w:pPr>
-      <w:hyperlink w:history="1" r:id="rIdf-5acpvnree1zbat2vtuw">
+      <w:hyperlink w:history="1" r:id="rId0bjqmw3l0akogk3faljua">
         <w:r>
           <w:rPr>
             <w:color w:val="0563C1"/>
@@ -2096,7 +2096,7 @@
       <w:pPr>
         <w:spacing w:after="40" w:line="300"/>
       </w:pPr>
-      <w:hyperlink w:history="1" r:id="rIdbj0d1zme0dc7bzhxwy3tp">
+      <w:hyperlink w:history="1" r:id="rIdxjdzclggz-jbkrnmpk-aq">
         <w:r>
           <w:rPr>
             <w:color w:val="0563C1"/>
@@ -3624,7 +3624,7 @@
       <w:pPr>
         <w:spacing w:after="40" w:line="300"/>
       </w:pPr>
-      <w:hyperlink w:history="1" r:id="rIdcli0gmc1kxjlcri9d6f-s">
+      <w:hyperlink w:history="1" r:id="rIdt-libupr4mo1iuzawihev">
         <w:r>
           <w:rPr>
             <w:color w:val="0563C1"/>
@@ -3646,7 +3646,7 @@
       <w:pPr>
         <w:spacing w:after="40" w:line="300"/>
       </w:pPr>
-      <w:hyperlink w:history="1" r:id="rIdwtn8xgkj5ceqalzamzfso">
+      <w:hyperlink w:history="1" r:id="rIdloglpiuirsavntntckeuo">
         <w:r>
           <w:rPr>
             <w:color w:val="0563C1"/>
@@ -3668,7 +3668,7 @@
       <w:pPr>
         <w:spacing w:after="40" w:line="300"/>
       </w:pPr>
-      <w:hyperlink w:history="1" r:id="rIdoz-mhnidgbbwcmrhrlj5o">
+      <w:hyperlink w:history="1" r:id="rId8nf81ol6ugytmrwromyz0">
         <w:r>
           <w:rPr>
             <w:color w:val="0563C1"/>
@@ -5449,7 +5449,7 @@
         <w:rPr>
           <w:color w:val="FF0000"/>
         </w:rPr>
-        <w:t xml:space="preserve">筆者は高校生のときに、2019年5月から2021年11月までの約2年半、フィジーで交換留学をした。2020年以降は新型コロナウイルスの流行と重なり、ロックダウンや隔離も経験した。</w:t>
+        <w:t xml:space="preserve">筆者は高校生のときに、2019年5月から2021年11月までの約2年半、フィジーで交換留学をした。2020年以降はコロナ禍と重なり、コロナ禍のロックダウンや2週間の隔離も経験した。</w:t>
       </w:r>
     </w:p>
     <w:p>
@@ -6280,7 +6280,7 @@
                 <w:sz w:val="19"/>
                 <w:szCs w:val="19"/>
               </w:rPr>
-              <w:t xml:space="preserve">コロナ</w:t>
+              <w:t xml:space="preserve">コロナ禍</w:t>
             </w:r>
           </w:p>
         </w:tc>
@@ -6340,7 +6340,7 @@
                 <w:sz w:val="19"/>
                 <w:szCs w:val="19"/>
               </w:rPr>
-              <w:t xml:space="preserve">ロックダウン、2週間の隔離、1か月外に出られない</w:t>
+              <w:t xml:space="preserve">コロナ禍のロックダウン、2週間の隔離、1か月外に出られない</w:t>
             </w:r>
           </w:p>
         </w:tc>
@@ -6582,7 +6582,7 @@
         <w:rPr>
           <w:color w:val="FF0000"/>
         </w:rPr>
-        <w:t xml:space="preserve">第三に、受け入れにくかった経験は、文化の習慣そのものよりも、人・安全・健康に関わるものが多い。ヒンディー語で悪口を言われる、中指を立てられる、バスの外から唾をかけられる、犬に噛まれる、病気になる、ロックダウンで心細くなるといった経験である。一方、手で食べることやお祈り、肉を食べない期間などの食や宗教の習慣は、多くが楽しい経験や新しい発見として記録されている。ただし羊の解体のように、命に関わる価値観の違いは、習慣であっても受け入れにくい。このことから、習慣の違いは「初めて」として楽しさに変わりやすいが、人からの敵意や危険、命に関わる価値観の違いは楽しさに変わりにくいと考えられる。</w:t>
+        <w:t xml:space="preserve">第三に、受け入れにくかった経験は、文化の習慣そのものよりも、人・安全・健康に関わるものが多い。ヒンディー語で悪口を言われる、中指を立てられる、バスの外から唾をかけられる、犬に噛まれる、病気になる、コロナ禍のロックダウンで心細くなるといった経験である。一方、手で食べることやお祈り、肉を食べない期間などの食や宗教の習慣は、多くが楽しい経験や新しい発見として記録されている。ただし羊の解体のように、命に関わる価値観の違いは、習慣であっても受け入れにくい。このことから、習慣の違いは「初めて」として楽しさに変わりやすいが、人からの敵意や危険、命に関わる価値観の違いは楽しさに変わりにくいと考えられる。</w:t>
       </w:r>
     </w:p>
     <w:p>
@@ -18250,7 +18250,7 @@
           <w:bCs/>
           <w:color w:val="FF0000"/>
         </w:rPr>
-        <w:t xml:space="preserve">コロナ（8件）</w:t>
+        <w:t xml:space="preserve">コロナ禍（8件）</w:t>
       </w:r>
     </w:p>
     <w:tbl>
@@ -18435,7 +18435,7 @@
                 <w:sz w:val="19"/>
                 <w:szCs w:val="19"/>
               </w:rPr>
-              <w:t xml:space="preserve">ロックダウンになったこと</w:t>
+              <w:t xml:space="preserve">コロナ禍でロックダウンになったこと</w:t>
             </w:r>
           </w:p>
         </w:tc>
@@ -20786,7 +20786,7 @@
   <w:docDefaults>
     <w:rPrDefault>
       <w:rPr>
-        <w:rFonts w:ascii="ＭＳ Ｐゴシック" w:cs="ＭＳ Ｐゴシック" w:eastAsia="ＭＳ Ｐゴシック" w:hAnsi="ＭＳ Ｐゴシック"/>
+        <w:rFonts w:ascii="游明朝" w:cs="游明朝" w:eastAsia="游明朝" w:hAnsi="游明朝"/>
         <w:sz w:val="21"/>
         <w:szCs w:val="21"/>
       </w:rPr>

</xml_diff>